<commit_message>
Update credit_statement: single author only
Remove Rafael González Quesada; keep only Hernán Díaz Rodríguez
with full CRediT roles.

Co-Authored-By: Claude Sonnet 4.6 <noreply@anthropic.com>
</commit_message>
<xml_diff>
--- a/paper/prl/submission/credit_statement.docx
+++ b/paper/prl/submission/credit_statement.docx
@@ -16,68 +16,6 @@
           <w:szCs w:val="28"/>
         </w:rPr>
         <w:t xml:space="preserve">CRediT Author Contribution Statement</w:t>
-      </w:r>
-    </w:p>
-    <w:p>
-      <w:pPr>
-        <w:spacing w:after="80"/>
-      </w:pPr>
-      <w:r>
-        <w:t xml:space="preserve"/>
-      </w:r>
-    </w:p>
-    <w:p>
-      <w:pPr>
-        <w:spacing w:after="160"/>
-      </w:pPr>
-      <w:r>
-        <w:rPr>
-          <w:rFonts w:ascii="Arial" w:cs="Arial" w:eastAsia="Arial" w:hAnsi="Arial"/>
-          <w:b/>
-          <w:bCs/>
-          <w:sz w:val="22"/>
-          <w:szCs w:val="22"/>
-        </w:rPr>
-        <w:t xml:space="preserve">Hernán Díaz Rodríguez: </w:t>
-      </w:r>
-      <w:r>
-        <w:rPr>
-          <w:rFonts w:ascii="Arial" w:cs="Arial" w:eastAsia="Arial" w:hAnsi="Arial"/>
-          <w:sz w:val="22"/>
-          <w:szCs w:val="22"/>
-        </w:rPr>
-        <w:t xml:space="preserve">Conceptualization, Methodology, Software, Formal analysis, Investigation, Validation, Visualization, Writing – original draft, Writing – review &amp; editing.</w:t>
-      </w:r>
-    </w:p>
-    <w:p>
-      <w:pPr>
-        <w:spacing w:after="80"/>
-      </w:pPr>
-      <w:r>
-        <w:t xml:space="preserve"/>
-      </w:r>
-    </w:p>
-    <w:p>
-      <w:pPr>
-        <w:spacing w:after="160"/>
-      </w:pPr>
-      <w:r>
-        <w:rPr>
-          <w:rFonts w:ascii="Arial" w:cs="Arial" w:eastAsia="Arial" w:hAnsi="Arial"/>
-          <w:b/>
-          <w:bCs/>
-          <w:sz w:val="22"/>
-          <w:szCs w:val="22"/>
-        </w:rPr>
-        <w:t xml:space="preserve">Rafael González Quesada: </w:t>
-      </w:r>
-      <w:r>
-        <w:rPr>
-          <w:rFonts w:ascii="Arial" w:cs="Arial" w:eastAsia="Arial" w:hAnsi="Arial"/>
-          <w:sz w:val="22"/>
-          <w:szCs w:val="22"/>
-        </w:rPr>
-        <w:t xml:space="preserve">Software, Data curation, Writing – original draft.</w:t>
       </w:r>
     </w:p>
     <w:sectPr>

</xml_diff>

<commit_message>
Fix submission docs and add TruFor fine-tuned evaluation
- Regenerate highlights_prl.docx and credit_statement.docx from scratch
  (previous files were corrupt/empty due to encoding issues)
- credit_statement.docx: sole author (Hernán Díaz Rodríguez) with all
  CRediT roles
- Add sota_comparison/03_eval_finetuned_comparison.py: three-way
  evaluation TruFor zero-shot / TruFor fine-tuned / DocVerify
- Add full_comparison_table.csv and full_comparison_table.tex with
  results (PR-AUC, ROC-AUC, Dice, F1-det@0.5 for all three systems)

Co-Authored-By: Claude Sonnet 4.6 <noreply@anthropic.com>
</commit_message>
<xml_diff>
--- a/paper/prl/submission/credit_statement.docx
+++ b/paper/prl/submission/credit_statement.docx
@@ -4,8 +4,7 @@
   <w:body>
     <w:p>
       <w:pPr>
-        <w:pStyle w:val="Heading1"/>
-        <w:spacing w:after="120" w:before="240"/>
+        <w:spacing w:after="400"/>
       </w:pPr>
       <w:r>
         <w:rPr>
@@ -16,6 +15,26 @@
           <w:szCs w:val="28"/>
         </w:rPr>
         <w:t xml:space="preserve">CRediT Author Contribution Statement</w:t>
+      </w:r>
+    </w:p>
+    <w:p>
+      <w:r>
+        <w:rPr>
+          <w:rFonts w:ascii="Arial" w:cs="Arial" w:eastAsia="Arial" w:hAnsi="Arial"/>
+          <w:b/>
+          <w:bCs/>
+          <w:sz w:val="22"/>
+          <w:szCs w:val="22"/>
+        </w:rPr>
+        <w:t xml:space="preserve">Hernán Díaz Rodríguez: </w:t>
+      </w:r>
+      <w:r>
+        <w:rPr>
+          <w:rFonts w:ascii="Arial" w:cs="Arial" w:eastAsia="Arial" w:hAnsi="Arial"/>
+          <w:sz w:val="22"/>
+          <w:szCs w:val="22"/>
+        </w:rPr>
+        <w:t xml:space="preserve">Conceptualization, Methodology, Software, Formal analysis, Investigation, Validation, Visualization, Writing – original draft, Writing – review &amp; editing.</w:t>
       </w:r>
     </w:p>
     <w:sectPr>
@@ -204,13 +223,7 @@
 <file path=word/styles.xml><?xml version="1.0" encoding="utf-8"?>
 <w:styles xmlns:mc="http://schemas.openxmlformats.org/markup-compatibility/2006" xmlns:r="http://schemas.openxmlformats.org/officeDocument/2006/relationships" xmlns:w="http://schemas.openxmlformats.org/wordprocessingml/2006/main" xmlns:w14="http://schemas.microsoft.com/office/word/2010/wordml" xmlns:w15="http://schemas.microsoft.com/office/word/2012/wordml" mc:Ignorable="w14 w15">
   <w:docDefaults>
-    <w:rPrDefault>
-      <w:rPr>
-        <w:rFonts w:ascii="Arial" w:cs="Arial" w:eastAsia="Arial" w:hAnsi="Arial"/>
-        <w:sz w:val="22"/>
-        <w:szCs w:val="22"/>
-      </w:rPr>
-    </w:rPrDefault>
+    <w:rPrDefault/>
     <w:pPrDefault/>
   </w:docDefaults>
   <w:style w:type="paragraph" w:styleId="Title">

</xml_diff>